<commit_message>
Add trading platform project and NISM cert to resume
- New QUANTITATIVE RESEARCH PROJECT section covering the self-built equity
  backtesting/screening platform: engineering scope, validation methodology
  (no look-ahead, walk-forward, Monte Carlo, cost stress) and findings,
  including the negative results
- All platform figures measured directly from trading_suite_v9.zip
- No P&L claim: my_trades.csv is empty and the +10.09% report came from
  synthetic sample data on a simulated paper account; page states 'simulated'
- NISM Series-VII (Securities Operations & Risk Management) added as in prep
- Content trimmed elsewhere to hold one page in both PDF and Word
- Fixed a reportlab KeepTogether issue that pushed the skills block to page 2
</commit_message>
<xml_diff>
--- a/resume/S-K-Lokesh-Resume.docx
+++ b/resume/S-K-Lokesh-Resume.docx
@@ -85,7 +85,7 @@
     </w:p>
     <w:p>
       <w:pPr>
-        <w:spacing w:before="88" w:after="0" w:lineRule="exact" w:line="227"/>
+        <w:spacing w:before="88" w:after="0" w:lineRule="exact" w:line="222"/>
         <w:jc w:val="both"/>
       </w:pPr>
       <w:r>
@@ -94,14 +94,14 @@
           <w:b w:val="0"/>
           <w:i w:val="0"/>
           <w:color w:val="000000"/>
-          <w:sz w:val="19"/>
+          <w:sz w:val="18"/>
         </w:rPr>
-        <w:t>Final-year B.Com student (Class of 2027) and CFA Level I candidate applying to Commercial &amp; Investment Bank Research &amp; Analytics – Securities Services (Alternative Fund Services) in Bengaluru, with the aim of building a career in fund accounting, portfolio accounting, NAV production, financial reporting and investor reporting. Delivered portfolio analytics at India’s largest listed wealth manager: automated rolling-return computation across 120+ funds in Python (~90% less manual effort), reconstructed and reconciled 5+ years of transaction history for cost-basis accuracy, and modelled PMS/AIF fee structures that surfaced INR 4.2 lakh of annual client savings. Brings quantitative rigour, a controls-first approach to reporting accuracy, and daily hands-on use of AI-enabled research tools.</w:t>
+        <w:t>Final-year B.Com student (Class of 2027) and CFA Level I candidate applying to Commercial &amp; Investment Bank Research &amp; Analytics – Securities Services (Alternative Fund Services), Bengaluru, with the aim of building a career in fund accounting, portfolio accounting, NAV production, financial reporting and investor reporting. Delivered portfolio analytics at India’s largest listed wealth manager – rolling returns for 120+ funds automated in Python (~90% less manual effort) and PMS/AIF fee modelling worth INR 4.2 lakh a year to a client – and independently built a 6,500-line Python backtesting platform validated across 16.5 years of market data.</w:t>
       </w:r>
     </w:p>
     <w:p>
       <w:pPr>
-        <w:spacing w:before="120" w:after="52" w:lineRule="exact" w:line="234"/>
+        <w:spacing w:before="80" w:after="52" w:lineRule="exact" w:line="234"/>
         <w:pBdr>
           <w:bottom w:val="single" w:sz="6" w:space="1" w:color="000000"/>
         </w:pBdr>
@@ -120,7 +120,7 @@
         <w:tabs>
           <w:tab w:pos="10325" w:val="right"/>
         </w:tabs>
-        <w:spacing w:before="0" w:after="0" w:lineRule="exact" w:line="227"/>
+        <w:spacing w:before="0" w:after="0" w:lineRule="exact" w:line="222"/>
       </w:pPr>
       <w:r>
         <w:rPr>
@@ -128,7 +128,7 @@
           <w:b/>
           <w:i w:val="0"/>
           <w:color w:val="000000"/>
-          <w:sz w:val="19"/>
+          <w:sz w:val="18"/>
         </w:rPr>
         <w:t>Bachelor of Commerce (B.Com)</w:t>
       </w:r>
@@ -138,7 +138,7 @@
           <w:b w:val="0"/>
           <w:i w:val="0"/>
           <w:color w:val="000000"/>
-          <w:sz w:val="19"/>
+          <w:sz w:val="18"/>
         </w:rPr>
         <w:t xml:space="preserve">  |  St. Joseph’s College of Commerce (Autonomous), Bengaluru</w:t>
       </w:r>
@@ -151,7 +151,7 @@
           <w:b/>
           <w:i w:val="0"/>
           <w:color w:val="000000"/>
-          <w:sz w:val="19"/>
+          <w:sz w:val="18"/>
         </w:rPr>
         <w:t>2024 – 2027</w:t>
       </w:r>
@@ -168,12 +168,12 @@
           <w:color w:val="000000"/>
           <w:sz w:val="17"/>
         </w:rPr>
-        <w:t>Affiliated to Bengaluru City University  ·  NAAC A++ accredited (4th cycle)  ·  Final year; expected graduation 2027</w:t>
+        <w:t>Affiliated to Bengaluru City University  ·  NAAC A++ accredited  ·  Final year, expected graduation 2027</w:t>
       </w:r>
     </w:p>
     <w:p>
       <w:pPr>
-        <w:spacing w:before="28" w:after="0" w:lineRule="exact" w:line="227"/>
+        <w:spacing w:before="28" w:after="0" w:lineRule="exact" w:line="222"/>
       </w:pPr>
       <w:r>
         <w:rPr>
@@ -181,7 +181,7 @@
           <w:b/>
           <w:i w:val="0"/>
           <w:color w:val="000000"/>
-          <w:sz w:val="19"/>
+          <w:sz w:val="18"/>
         </w:rPr>
         <w:t>Relevant coursework:</w:t>
       </w:r>
@@ -191,14 +191,14 @@
           <w:b w:val="0"/>
           <w:i w:val="0"/>
           <w:color w:val="000000"/>
-          <w:sz w:val="19"/>
+          <w:sz w:val="18"/>
         </w:rPr>
         <w:t xml:space="preserve"> Financial Accounting, Corporate Finance, Investment Management, Business Statistics, Taxation, Economics</w:t>
       </w:r>
     </w:p>
     <w:p>
       <w:pPr>
-        <w:spacing w:before="0" w:after="0" w:lineRule="exact" w:line="72"/>
+        <w:spacing w:before="0" w:after="0" w:lineRule="exact" w:line="64"/>
       </w:pPr>
     </w:p>
     <w:p>
@@ -206,7 +206,7 @@
         <w:tabs>
           <w:tab w:pos="10325" w:val="right"/>
         </w:tabs>
-        <w:spacing w:before="0" w:after="0" w:lineRule="exact" w:line="227"/>
+        <w:spacing w:before="0" w:after="0" w:lineRule="exact" w:line="222"/>
       </w:pPr>
       <w:r>
         <w:rPr>
@@ -214,7 +214,7 @@
           <w:b/>
           <w:i w:val="0"/>
           <w:color w:val="000000"/>
-          <w:sz w:val="19"/>
+          <w:sz w:val="18"/>
         </w:rPr>
         <w:t>Class XII – Pre-University (Commerce)</w:t>
       </w:r>
@@ -224,7 +224,7 @@
           <w:b w:val="0"/>
           <w:i w:val="0"/>
           <w:color w:val="000000"/>
-          <w:sz w:val="19"/>
+          <w:sz w:val="18"/>
         </w:rPr>
         <w:t xml:space="preserve">  |  Seshadripuram Independent PU College  ·  Karnataka State Board</w:t>
       </w:r>
@@ -237,14 +237,14 @@
           <w:b/>
           <w:i w:val="0"/>
           <w:color w:val="000000"/>
-          <w:sz w:val="19"/>
+          <w:sz w:val="18"/>
         </w:rPr>
         <w:t>93%  ·  2024</w:t>
       </w:r>
     </w:p>
     <w:p>
       <w:pPr>
-        <w:spacing w:before="0" w:after="0" w:lineRule="exact" w:line="72"/>
+        <w:spacing w:before="0" w:after="0" w:lineRule="exact" w:line="64"/>
       </w:pPr>
     </w:p>
     <w:p>
@@ -252,7 +252,7 @@
         <w:tabs>
           <w:tab w:pos="10325" w:val="right"/>
         </w:tabs>
-        <w:spacing w:before="0" w:after="0" w:lineRule="exact" w:line="227"/>
+        <w:spacing w:before="0" w:after="0" w:lineRule="exact" w:line="222"/>
       </w:pPr>
       <w:r>
         <w:rPr>
@@ -260,7 +260,7 @@
           <w:b/>
           <w:i w:val="0"/>
           <w:color w:val="000000"/>
-          <w:sz w:val="19"/>
+          <w:sz w:val="18"/>
         </w:rPr>
         <w:t>Class X – Secondary School Certificate (SSLC)</w:t>
       </w:r>
@@ -270,7 +270,7 @@
           <w:b w:val="0"/>
           <w:i w:val="0"/>
           <w:color w:val="000000"/>
-          <w:sz w:val="19"/>
+          <w:sz w:val="18"/>
         </w:rPr>
         <w:t xml:space="preserve">  |  St. Anthony’s Boys’ High School  ·  Karnataka State Board</w:t>
       </w:r>
@@ -283,14 +283,14 @@
           <w:b/>
           <w:i w:val="0"/>
           <w:color w:val="000000"/>
-          <w:sz w:val="19"/>
+          <w:sz w:val="18"/>
         </w:rPr>
         <w:t>80%  ·  2022</w:t>
       </w:r>
     </w:p>
     <w:p>
       <w:pPr>
-        <w:spacing w:before="120" w:after="52" w:lineRule="exact" w:line="234"/>
+        <w:spacing w:before="80" w:after="52" w:lineRule="exact" w:line="234"/>
         <w:pBdr>
           <w:bottom w:val="single" w:sz="6" w:space="1" w:color="000000"/>
         </w:pBdr>
@@ -309,7 +309,7 @@
         <w:tabs>
           <w:tab w:pos="10325" w:val="right"/>
         </w:tabs>
-        <w:spacing w:before="0" w:after="0" w:lineRule="exact" w:line="227"/>
+        <w:spacing w:before="0" w:after="0" w:lineRule="exact" w:line="222"/>
       </w:pPr>
       <w:r>
         <w:rPr>
@@ -317,7 +317,7 @@
           <w:b/>
           <w:i w:val="0"/>
           <w:color w:val="000000"/>
-          <w:sz w:val="19"/>
+          <w:sz w:val="18"/>
         </w:rPr>
         <w:t>360 ONE Portfolio Managers Limited</w:t>
       </w:r>
@@ -327,7 +327,7 @@
           <w:b w:val="0"/>
           <w:i w:val="0"/>
           <w:color w:val="000000"/>
-          <w:sz w:val="19"/>
+          <w:sz w:val="18"/>
         </w:rPr>
         <w:t xml:space="preserve">  |  Finance Intern – Wealth Management</w:t>
       </w:r>
@@ -340,7 +340,7 @@
           <w:b/>
           <w:i w:val="0"/>
           <w:color w:val="000000"/>
-          <w:sz w:val="19"/>
+          <w:sz w:val="18"/>
         </w:rPr>
         <w:t>May – Jun 2026</w:t>
       </w:r>
@@ -357,12 +357,12 @@
           <w:color w:val="000000"/>
           <w:sz w:val="17"/>
         </w:rPr>
-        <w:t>India’s largest listed wealth manager (NSE/BSE listed; INR 6 lakh crore+ client assets); PMS, AIF and mutual fund solutions for HNI and family-office clients  ·  Bengaluru, India</w:t>
+        <w:t>India’s largest listed wealth manager (NSE/BSE listed; INR 6 lakh crore+ client assets)  ·  Bengaluru, India</w:t>
       </w:r>
     </w:p>
     <w:p>
       <w:pPr>
-        <w:spacing w:before="28" w:after="0" w:lineRule="exact" w:line="227"/>
+        <w:spacing w:before="28" w:after="0" w:lineRule="exact" w:line="222"/>
         <w:ind w:left="220" w:hanging="220"/>
       </w:pPr>
       <w:r>
@@ -371,7 +371,7 @@
           <w:b w:val="0"/>
           <w:i w:val="0"/>
           <w:color w:val="000000"/>
-          <w:sz w:val="19"/>
+          <w:sz w:val="18"/>
         </w:rPr>
         <w:t xml:space="preserve">•   </w:t>
       </w:r>
@@ -381,7 +381,7 @@
           <w:b/>
           <w:i w:val="0"/>
           <w:color w:val="000000"/>
-          <w:sz w:val="19"/>
+          <w:sz w:val="18"/>
         </w:rPr>
         <w:t>Portfolio analytics &amp; automation:</w:t>
       </w:r>
@@ -391,14 +391,14 @@
           <w:b w:val="0"/>
           <w:i w:val="0"/>
           <w:color w:val="000000"/>
-          <w:sz w:val="19"/>
+          <w:sz w:val="18"/>
         </w:rPr>
-        <w:t xml:space="preserve"> Engineered a Python framework (pandas, openpyxl) that computed 6M/1Y/3Y/5Y rolling returns from NAV histories for 120+ mutual funds across Large, Mid, Small and Flexi Cap categories, cutting manual data processing time by ~90% and standardising output for advisory review.</w:t>
+        <w:t xml:space="preserve"> Engineered a Python framework (pandas, openpyxl) that computed 6M/1Y/3Y/5Y rolling returns from NAV histories for 120+ mutual funds across Large, Mid, Small and Flexi Cap categories, cutting manual data processing time by ~90%.</w:t>
       </w:r>
     </w:p>
     <w:p>
       <w:pPr>
-        <w:spacing w:before="28" w:after="0" w:lineRule="exact" w:line="227"/>
+        <w:spacing w:before="28" w:after="0" w:lineRule="exact" w:line="222"/>
         <w:ind w:left="220" w:hanging="220"/>
       </w:pPr>
       <w:r>
@@ -407,7 +407,7 @@
           <w:b w:val="0"/>
           <w:i w:val="0"/>
           <w:color w:val="000000"/>
-          <w:sz w:val="19"/>
+          <w:sz w:val="18"/>
         </w:rPr>
         <w:t xml:space="preserve">•   </w:t>
       </w:r>
@@ -417,9 +417,9 @@
           <w:b/>
           <w:i w:val="0"/>
           <w:color w:val="000000"/>
-          <w:sz w:val="19"/>
+          <w:sz w:val="18"/>
         </w:rPr>
-        <w:t>Reconciliation &amp; cost-basis analysis:</w:t>
+        <w:t>Reconciliation &amp; cost basis:</w:t>
       </w:r>
       <w:r>
         <w:rPr>
@@ -427,14 +427,14 @@
           <w:b w:val="0"/>
           <w:i w:val="0"/>
           <w:color w:val="000000"/>
-          <w:sz w:val="19"/>
+          <w:sz w:val="18"/>
         </w:rPr>
-        <w:t xml:space="preserve"> Reconstructed 5+ years of transaction history from Script Cashflow reports to reconcile cost basis and compute LTCG/STCG liability on 6 equity instruments held by an HNI family portfolio, applying post-Budget 2024 tax rates.</w:t>
+        <w:t xml:space="preserve"> Reconstructed 5+ years of transaction history from Script Cashflow reports to reconcile cost basis and compute LTCG/STCG liability on 6 equity instruments in an HNI family portfolio at post-Budget 2024 rates.</w:t>
       </w:r>
     </w:p>
     <w:p>
       <w:pPr>
-        <w:spacing w:before="28" w:after="0" w:lineRule="exact" w:line="227"/>
+        <w:spacing w:before="28" w:after="0" w:lineRule="exact" w:line="222"/>
         <w:ind w:left="220" w:hanging="220"/>
       </w:pPr>
       <w:r>
@@ -443,7 +443,7 @@
           <w:b w:val="0"/>
           <w:i w:val="0"/>
           <w:color w:val="000000"/>
-          <w:sz w:val="19"/>
+          <w:sz w:val="18"/>
         </w:rPr>
         <w:t xml:space="preserve">•   </w:t>
       </w:r>
@@ -453,7 +453,7 @@
           <w:b/>
           <w:i w:val="0"/>
           <w:color w:val="000000"/>
-          <w:sz w:val="19"/>
+          <w:sz w:val="18"/>
         </w:rPr>
         <w:t>Fee &amp; expense modelling:</w:t>
       </w:r>
@@ -463,14 +463,14 @@
           <w:b w:val="0"/>
           <w:i w:val="0"/>
           <w:color w:val="000000"/>
-          <w:sz w:val="19"/>
+          <w:sz w:val="18"/>
         </w:rPr>
         <w:t xml:space="preserve"> Modelled PMS/AIF fee structures across 9 holdings (1.94% weighted-average fixed fee) and quantified an INR 4.2 lakh annual saving by moving a 10-fund mutual fund portfolio from regular to direct plans.</w:t>
       </w:r>
     </w:p>
     <w:p>
       <w:pPr>
-        <w:spacing w:before="28" w:after="0" w:lineRule="exact" w:line="227"/>
+        <w:spacing w:before="28" w:after="0" w:lineRule="exact" w:line="222"/>
         <w:ind w:left="220" w:hanging="220"/>
       </w:pPr>
       <w:r>
@@ -479,7 +479,7 @@
           <w:b w:val="0"/>
           <w:i w:val="0"/>
           <w:color w:val="000000"/>
-          <w:sz w:val="19"/>
+          <w:sz w:val="18"/>
         </w:rPr>
         <w:t xml:space="preserve">•   </w:t>
       </w:r>
@@ -489,7 +489,7 @@
           <w:b/>
           <w:i w:val="0"/>
           <w:color w:val="000000"/>
-          <w:sz w:val="19"/>
+          <w:sz w:val="18"/>
         </w:rPr>
         <w:t>Reference data &amp; Bloomberg:</w:t>
       </w:r>
@@ -499,14 +499,14 @@
           <w:b w:val="0"/>
           <w:i w:val="0"/>
           <w:color w:val="000000"/>
-          <w:sz w:val="19"/>
+          <w:sz w:val="18"/>
         </w:rPr>
-        <w:t xml:space="preserve"> Maintained a 4,000+ security BSE/NSE dataset using Bloomberg BDH/BDP formulas and mapped client holdings against internal model portfolios to generate Buy/Sell/Hold recommendations for Investment Counsellors.</w:t>
+        <w:t xml:space="preserve"> Maintained a 4,000+ security BSE/NSE dataset with Bloomberg BDH/BDP formulas and mapped client holdings against model portfolios to generate Buy/Sell/Hold calls for Investment Counsellors.</w:t>
       </w:r>
     </w:p>
     <w:p>
       <w:pPr>
-        <w:spacing w:before="28" w:after="0" w:lineRule="exact" w:line="227"/>
+        <w:spacing w:before="28" w:after="0" w:lineRule="exact" w:line="222"/>
         <w:ind w:left="220" w:hanging="220"/>
       </w:pPr>
       <w:r>
@@ -515,7 +515,7 @@
           <w:b w:val="0"/>
           <w:i w:val="0"/>
           <w:color w:val="000000"/>
-          <w:sz w:val="19"/>
+          <w:sz w:val="18"/>
         </w:rPr>
         <w:t xml:space="preserve">•   </w:t>
       </w:r>
@@ -525,9 +525,9 @@
           <w:b/>
           <w:i w:val="0"/>
           <w:color w:val="000000"/>
-          <w:sz w:val="19"/>
+          <w:sz w:val="18"/>
         </w:rPr>
-        <w:t>Client reporting &amp; presentation:</w:t>
+        <w:t>Client reporting:</w:t>
       </w:r>
       <w:r>
         <w:rPr>
@@ -535,14 +535,14 @@
           <w:b w:val="0"/>
           <w:i w:val="0"/>
           <w:color w:val="000000"/>
-          <w:sz w:val="19"/>
+          <w:sz w:val="18"/>
         </w:rPr>
-        <w:t xml:space="preserve"> Co-authored a 30+ slide institutional deck on active vs. passive fund performance – rolling alpha, hit rates and alpha dispersion by market-cap segment – used by advisory teams in client discussions.</w:t>
+        <w:t xml:space="preserve"> Co-authored a 30+ slide institutional deck on active vs. passive fund performance (rolling alpha, hit rates, alpha dispersion by market-cap segment) used by advisory teams with clients.</w:t>
       </w:r>
     </w:p>
     <w:p>
       <w:pPr>
-        <w:spacing w:before="0" w:after="0" w:lineRule="exact" w:line="72"/>
+        <w:spacing w:before="0" w:after="0" w:lineRule="exact" w:line="64"/>
       </w:pPr>
     </w:p>
     <w:p>
@@ -550,7 +550,7 @@
         <w:tabs>
           <w:tab w:pos="10325" w:val="right"/>
         </w:tabs>
-        <w:spacing w:before="0" w:after="0" w:lineRule="exact" w:line="227"/>
+        <w:spacing w:before="0" w:after="0" w:lineRule="exact" w:line="222"/>
       </w:pPr>
       <w:r>
         <w:rPr>
@@ -558,7 +558,7 @@
           <w:b/>
           <w:i w:val="0"/>
           <w:color w:val="000000"/>
-          <w:sz w:val="19"/>
+          <w:sz w:val="18"/>
         </w:rPr>
         <w:t>Guanella Preethi Nivas (Preethi Nivas Trust)</w:t>
       </w:r>
@@ -568,7 +568,7 @@
           <w:b w:val="0"/>
           <w:i w:val="0"/>
           <w:color w:val="000000"/>
-          <w:sz w:val="19"/>
+          <w:sz w:val="18"/>
         </w:rPr>
         <w:t xml:space="preserve">  |  Social Intern</w:t>
       </w:r>
@@ -581,7 +581,7 @@
           <w:b/>
           <w:i w:val="0"/>
           <w:color w:val="000000"/>
-          <w:sz w:val="19"/>
+          <w:sz w:val="18"/>
         </w:rPr>
         <w:t>May 2025 (60 hours)</w:t>
       </w:r>
@@ -598,12 +598,12 @@
           <w:color w:val="000000"/>
           <w:sz w:val="17"/>
         </w:rPr>
-        <w:t>Charitable home for destitute elderly men run by The Guanellian Society; 50+ residents  ·  Bengaluru, India</w:t>
+        <w:t>Charitable home for 50+ destitute elderly residents, run by The Guanellian Society  ·  Bengaluru, India</w:t>
       </w:r>
     </w:p>
     <w:p>
       <w:pPr>
-        <w:spacing w:before="28" w:after="0" w:lineRule="exact" w:line="227"/>
+        <w:spacing w:before="28" w:after="0" w:lineRule="exact" w:line="222"/>
         <w:ind w:left="220" w:hanging="220"/>
       </w:pPr>
       <w:r>
@@ -612,7 +612,95 @@
           <w:b w:val="0"/>
           <w:i w:val="0"/>
           <w:color w:val="000000"/>
-          <w:sz w:val="19"/>
+          <w:sz w:val="18"/>
+        </w:rPr>
+        <w:t>•   Rebuilt resident records, activity logs and medical-room inventory, and ran safety audits (extinguisher expiry, hazard documentation, signage) to support compliance, preparing the reporting decks used by staff.</w:t>
+      </w:r>
+    </w:p>
+    <w:p>
+      <w:pPr>
+        <w:spacing w:before="80" w:after="52" w:lineRule="exact" w:line="234"/>
+        <w:pBdr>
+          <w:bottom w:val="single" w:sz="6" w:space="1" w:color="000000"/>
+        </w:pBdr>
+      </w:pPr>
+      <w:r>
+        <w:rPr>
+          <w:rFonts w:ascii="Times New Roman" w:hAnsi="Times New Roman"/>
+          <w:b/>
+          <w:sz w:val="20"/>
+        </w:rPr>
+        <w:t>QUANTITATIVE RESEARCH PROJECT</w:t>
+      </w:r>
+    </w:p>
+    <w:p>
+      <w:pPr>
+        <w:tabs>
+          <w:tab w:pos="10325" w:val="right"/>
+        </w:tabs>
+        <w:spacing w:before="0" w:after="0" w:lineRule="exact" w:line="222"/>
+      </w:pPr>
+      <w:r>
+        <w:rPr>
+          <w:rFonts w:ascii="Times New Roman" w:hAnsi="Times New Roman"/>
+          <w:b/>
+          <w:i w:val="0"/>
+          <w:color w:val="000000"/>
+          <w:sz w:val="18"/>
+        </w:rPr>
+        <w:t>Equity Backtesting &amp; Screening Platform</w:t>
+      </w:r>
+      <w:r>
+        <w:rPr>
+          <w:rFonts w:ascii="Times New Roman" w:hAnsi="Times New Roman"/>
+          <w:b w:val="0"/>
+          <w:i w:val="0"/>
+          <w:color w:val="000000"/>
+          <w:sz w:val="18"/>
+        </w:rPr>
+        <w:t xml:space="preserve">  |  Independent Python project, AI-assisted build</w:t>
+      </w:r>
+      <w:r>
+        <w:tab/>
+      </w:r>
+      <w:r>
+        <w:rPr>
+          <w:rFonts w:ascii="Times New Roman" w:hAnsi="Times New Roman"/>
+          <w:b/>
+          <w:i w:val="0"/>
+          <w:color w:val="000000"/>
+          <w:sz w:val="18"/>
+        </w:rPr>
+        <w:t>2026</w:t>
+      </w:r>
+    </w:p>
+    <w:p>
+      <w:pPr>
+        <w:spacing w:before="16" w:after="0" w:lineRule="exact" w:line="218"/>
+      </w:pPr>
+      <w:r>
+        <w:rPr>
+          <w:rFonts w:ascii="Times New Roman" w:hAnsi="Times New Roman"/>
+          <w:b w:val="0"/>
+          <w:i/>
+          <w:color w:val="000000"/>
+          <w:sz w:val="17"/>
+        </w:rPr>
+        <w:t>6,500-line research stack, 10 build iterations; run daily to screen a 500-name US universe for a USD 100,000 simulated paper-trading portfolio  ·  also a 2+ year retail investor in Indian equities</w:t>
+      </w:r>
+    </w:p>
+    <w:p>
+      <w:pPr>
+        <w:spacing w:before="28" w:after="0" w:lineRule="exact" w:line="222"/>
+        <w:ind w:left="220" w:hanging="220"/>
+      </w:pPr>
+      <w:r>
+        <w:rPr>
+          <w:rFonts w:ascii="Times New Roman" w:hAnsi="Times New Roman"/>
+          <w:b w:val="0"/>
+          <w:i w:val="0"/>
+          <w:color w:val="000000"/>
+          <w:sz w:val="18"/>
         </w:rPr>
         <w:t xml:space="preserve">•   </w:t>
       </w:r>
@@ -622,9 +710,9 @@
           <w:b/>
           <w:i w:val="0"/>
           <w:color w:val="000000"/>
-          <w:sz w:val="19"/>
+          <w:sz w:val="18"/>
         </w:rPr>
-        <w:t>Records &amp; documentation:</w:t>
+        <w:t>Engineering:</w:t>
       </w:r>
       <w:r>
         <w:rPr>
@@ -632,14 +720,14 @@
           <w:b w:val="0"/>
           <w:i w:val="0"/>
           <w:color w:val="000000"/>
-          <w:sz w:val="19"/>
+          <w:sz w:val="18"/>
         </w:rPr>
-        <w:t xml:space="preserve"> Rebuilt resident records, daily activity logs and medical-room inventory for a 50+ resident facility – categorising and labelling pharmaceutical supplies – improving retrieval speed during medication rounds and emergency response.</w:t>
+        <w:t xml:space="preserve"> Built a modular platform (pandas, NumPy, yfinance, Matplotlib) spanning data ingestion, 12 technical indicators, a backtest engine, ATR stops, 1%-risk sizing, performance analytics (Sharpe, Sortino, profit factor, expectancy, R-multiples) and automated reporting.</w:t>
       </w:r>
     </w:p>
     <w:p>
       <w:pPr>
-        <w:spacing w:before="28" w:after="0" w:lineRule="exact" w:line="227"/>
+        <w:spacing w:before="28" w:after="0" w:lineRule="exact" w:line="222"/>
         <w:ind w:left="220" w:hanging="220"/>
       </w:pPr>
       <w:r>
@@ -648,7 +736,7 @@
           <w:b w:val="0"/>
           <w:i w:val="0"/>
           <w:color w:val="000000"/>
-          <w:sz w:val="19"/>
+          <w:sz w:val="18"/>
         </w:rPr>
         <w:t xml:space="preserve">•   </w:t>
       </w:r>
@@ -658,9 +746,9 @@
           <w:b/>
           <w:i w:val="0"/>
           <w:color w:val="000000"/>
-          <w:sz w:val="19"/>
+          <w:sz w:val="18"/>
         </w:rPr>
-        <w:t>Controls, compliance &amp; safety review:</w:t>
+        <w:t>Validation methodology:</w:t>
       </w:r>
       <w:r>
         <w:rPr>
@@ -668,14 +756,50 @@
           <w:b w:val="0"/>
           <w:i w:val="0"/>
           <w:color w:val="000000"/>
-          <w:sz w:val="19"/>
+          <w:sz w:val="18"/>
         </w:rPr>
-        <w:t xml:space="preserve"> Ran facility safety audits – fire-extinguisher expiry checks, hazard documentation and disaster-awareness signage – to support safety compliance, and prepared the PowerPoint decks and structured reports used by staff.</w:t>
+        <w:t xml:space="preserve"> Tested 7 long and short strategies over 16.5 years (2010–2026) across 504- and 1,001-symbol universes and 8,600+ simulated trades: signals read at the close and filled at the next open to remove look-ahead, commission and slippage on every fill, walk-forward 3y-train/1y-test windows, and Monte-Carlo sampling of 250 ten-day windows.</w:t>
       </w:r>
     </w:p>
     <w:p>
       <w:pPr>
-        <w:spacing w:before="120" w:after="52" w:lineRule="exact" w:line="234"/>
+        <w:spacing w:before="28" w:after="0" w:lineRule="exact" w:line="222"/>
+        <w:ind w:left="220" w:hanging="220"/>
+      </w:pPr>
+      <w:r>
+        <w:rPr>
+          <w:rFonts w:ascii="Times New Roman" w:hAnsi="Times New Roman"/>
+          <w:b w:val="0"/>
+          <w:i w:val="0"/>
+          <w:color w:val="000000"/>
+          <w:sz w:val="18"/>
+        </w:rPr>
+        <w:t xml:space="preserve">•   </w:t>
+      </w:r>
+      <w:r>
+        <w:rPr>
+          <w:rFonts w:ascii="Times New Roman" w:hAnsi="Times New Roman"/>
+          <w:b/>
+          <w:i w:val="0"/>
+          <w:color w:val="000000"/>
+          <w:sz w:val="18"/>
+        </w:rPr>
+        <w:t>Findings, negative results included:</w:t>
+      </w:r>
+      <w:r>
+        <w:rPr>
+          <w:rFonts w:ascii="Times New Roman" w:hAnsi="Times New Roman"/>
+          <w:b w:val="0"/>
+          <w:i w:val="0"/>
+          <w:color w:val="000000"/>
+          <w:sz w:val="18"/>
+        </w:rPr>
+        <w:t xml:space="preserve"> Showed a multi-indicator confluence score did not lift win rate (flat 60–62% across score buckets) and that widening the universe from 504 to 1,001 names cut CAGR 5.3% to 1.2%; a graduated regime filter cut max drawdown −34.5% to −28.8%, and the edge disappeared at 2–3x assumed costs – reported with survivorship-bias and regime caveats rather than optimised results.</w:t>
+      </w:r>
+    </w:p>
+    <w:p>
+      <w:pPr>
+        <w:spacing w:before="80" w:after="52" w:lineRule="exact" w:line="234"/>
         <w:pBdr>
           <w:bottom w:val="single" w:sz="6" w:space="1" w:color="000000"/>
         </w:pBdr>
@@ -694,7 +818,7 @@
         <w:tabs>
           <w:tab w:pos="10325" w:val="right"/>
         </w:tabs>
-        <w:spacing w:before="0" w:after="0" w:lineRule="exact" w:line="227"/>
+        <w:spacing w:before="0" w:after="0" w:lineRule="exact" w:line="222"/>
       </w:pPr>
       <w:r>
         <w:rPr>
@@ -702,7 +826,7 @@
           <w:b/>
           <w:i w:val="0"/>
           <w:color w:val="000000"/>
-          <w:sz w:val="19"/>
+          <w:sz w:val="18"/>
         </w:rPr>
         <w:t>National Service Scheme (NSS), St. Joseph’s College of Commerce</w:t>
       </w:r>
@@ -712,7 +836,7 @@
           <w:b w:val="0"/>
           <w:i w:val="0"/>
           <w:color w:val="000000"/>
-          <w:sz w:val="19"/>
+          <w:sz w:val="18"/>
         </w:rPr>
         <w:t xml:space="preserve">  |  Treasurer (elected)</w:t>
       </w:r>
@@ -725,14 +849,14 @@
           <w:b/>
           <w:i w:val="0"/>
           <w:color w:val="000000"/>
-          <w:sz w:val="19"/>
+          <w:sz w:val="18"/>
         </w:rPr>
         <w:t>Bengaluru, India</w:t>
       </w:r>
     </w:p>
     <w:p>
       <w:pPr>
-        <w:spacing w:before="28" w:after="0" w:lineRule="exact" w:line="227"/>
+        <w:spacing w:before="28" w:after="0" w:lineRule="exact" w:line="222"/>
         <w:ind w:left="220" w:hanging="220"/>
       </w:pPr>
       <w:r>
@@ -741,92 +865,14 @@
           <w:b w:val="0"/>
           <w:i w:val="0"/>
           <w:color w:val="000000"/>
-          <w:sz w:val="19"/>
+          <w:sz w:val="18"/>
         </w:rPr>
-        <w:t>•   Elected treasurer of a 100+ member unit; own the annual budget, fund allocation and expense records across unit programmes.</w:t>
+        <w:t>•   Elected treasurer of a 100+ member unit; own the annual budget, fund allocation and expense records. Completed 2 rural exposure camps (8 days each) running community development surveys and field projects.</w:t>
       </w:r>
     </w:p>
     <w:p>
       <w:pPr>
-        <w:spacing w:before="28" w:after="0" w:lineRule="exact" w:line="227"/>
-        <w:ind w:left="220" w:hanging="220"/>
-      </w:pPr>
-      <w:r>
-        <w:rPr>
-          <w:rFonts w:ascii="Times New Roman" w:hAnsi="Times New Roman"/>
-          <w:b w:val="0"/>
-          <w:i w:val="0"/>
-          <w:color w:val="000000"/>
-          <w:sz w:val="19"/>
-        </w:rPr>
-        <w:t>•   Completed 2 rural exposure camps (8 days each), running community development surveys and field projects alongside volunteer teams.</w:t>
-      </w:r>
-    </w:p>
-    <w:p>
-      <w:pPr>
-        <w:spacing w:before="0" w:after="0" w:lineRule="exact" w:line="72"/>
-      </w:pPr>
-    </w:p>
-    <w:p>
-      <w:pPr>
-        <w:tabs>
-          <w:tab w:pos="10325" w:val="right"/>
-        </w:tabs>
-        <w:spacing w:before="0" w:after="0" w:lineRule="exact" w:line="227"/>
-      </w:pPr>
-      <w:r>
-        <w:rPr>
-          <w:rFonts w:ascii="Times New Roman" w:hAnsi="Times New Roman"/>
-          <w:b/>
-          <w:i w:val="0"/>
-          <w:color w:val="000000"/>
-          <w:sz w:val="19"/>
-        </w:rPr>
-        <w:t>Independent Equity Markets Research</w:t>
-      </w:r>
-      <w:r>
-        <w:rPr>
-          <w:rFonts w:ascii="Times New Roman" w:hAnsi="Times New Roman"/>
-          <w:b w:val="0"/>
-          <w:i w:val="0"/>
-          <w:color w:val="000000"/>
-          <w:sz w:val="19"/>
-        </w:rPr>
-        <w:t xml:space="preserve">  |  Self-directed</w:t>
-      </w:r>
-      <w:r>
-        <w:tab/>
-      </w:r>
-      <w:r>
-        <w:rPr>
-          <w:rFonts w:ascii="Times New Roman" w:hAnsi="Times New Roman"/>
-          <w:b/>
-          <w:i w:val="0"/>
-          <w:color w:val="000000"/>
-          <w:sz w:val="19"/>
-        </w:rPr>
-        <w:t>Ongoing (2+ years)</w:t>
-      </w:r>
-    </w:p>
-    <w:p>
-      <w:pPr>
-        <w:spacing w:before="28" w:after="0" w:lineRule="exact" w:line="227"/>
-        <w:ind w:left="220" w:hanging="220"/>
-      </w:pPr>
-      <w:r>
-        <w:rPr>
-          <w:rFonts w:ascii="Times New Roman" w:hAnsi="Times New Roman"/>
-          <w:b w:val="0"/>
-          <w:i w:val="0"/>
-          <w:color w:val="000000"/>
-          <w:sz w:val="19"/>
-        </w:rPr>
-        <w:t>•   Active retail investor applying a multi-factor screening framework (valuation, momentum, quality) across Indian equities using Screener.in, Chartink and TradingView; maintain a personal watchlist and trade log.</w:t>
-      </w:r>
-    </w:p>
-    <w:p>
-      <w:pPr>
-        <w:spacing w:before="120" w:after="52" w:lineRule="exact" w:line="234"/>
+        <w:spacing w:before="80" w:after="52" w:lineRule="exact" w:line="234"/>
         <w:pBdr>
           <w:bottom w:val="single" w:sz="6" w:space="1" w:color="000000"/>
         </w:pBdr>
@@ -842,7 +888,7 @@
     </w:p>
     <w:p>
       <w:pPr>
-        <w:spacing w:before="32" w:after="0" w:lineRule="exact" w:line="227"/>
+        <w:spacing w:before="32" w:after="0" w:lineRule="exact" w:line="222"/>
       </w:pPr>
       <w:r>
         <w:rPr>
@@ -850,7 +896,7 @@
           <w:b/>
           <w:i w:val="0"/>
           <w:color w:val="000000"/>
-          <w:sz w:val="19"/>
+          <w:sz w:val="18"/>
         </w:rPr>
         <w:t>Certifications:</w:t>
       </w:r>
@@ -860,14 +906,14 @@
           <w:b w:val="0"/>
           <w:i w:val="0"/>
           <w:color w:val="000000"/>
-          <w:sz w:val="19"/>
+          <w:sz w:val="18"/>
         </w:rPr>
-        <w:t xml:space="preserve"> CFA Program – Level I candidate, February 2027 exam window (CFA Institute)  ·  Excel Skills for Business – Macquarie University (Coursera)  ·  Soft Skills Development – NPTEL / SWAYAM (IIT)</w:t>
+        <w:t xml:space="preserve"> CFA Level I candidate – Feb 2027 window (CFA Institute)  ·  NISM Series-VII: Securities Operations &amp; Risk Management – in preparation  ·  Excel Skills for Business – Macquarie University (Coursera)  ·  Soft Skills Development – NPTEL / SWAYAM (IIT)</w:t>
       </w:r>
     </w:p>
     <w:p>
       <w:pPr>
-        <w:spacing w:before="32" w:after="0" w:lineRule="exact" w:line="227"/>
+        <w:spacing w:before="32" w:after="0" w:lineRule="exact" w:line="222"/>
       </w:pPr>
       <w:r>
         <w:rPr>
@@ -875,7 +921,7 @@
           <w:b/>
           <w:i w:val="0"/>
           <w:color w:val="000000"/>
-          <w:sz w:val="19"/>
+          <w:sz w:val="18"/>
         </w:rPr>
         <w:t>Fund &amp; Portfolio Analytics:</w:t>
       </w:r>
@@ -885,14 +931,14 @@
           <w:b w:val="0"/>
           <w:i w:val="0"/>
           <w:color w:val="000000"/>
-          <w:sz w:val="19"/>
+          <w:sz w:val="18"/>
         </w:rPr>
-        <w:t xml:space="preserve"> Rolling returns from NAV histories, portfolio mapping vs. model portfolios, active vs. passive performance analysis (alpha, hit rate, dispersion), fee &amp; expense modelling (PMS/AIF), reconciliations, cost-basis analysis, capital gains taxation (LTCG/STCG), financial statement analysis</w:t>
+        <w:t xml:space="preserve"> Rolling returns from NAV histories, portfolio mapping vs. model portfolios, performance analysis (alpha, hit rate, dispersion), fee &amp; expense modelling (PMS/AIF), reconciliations, cost basis, capital gains tax, financial statement analysis</w:t>
       </w:r>
     </w:p>
     <w:p>
       <w:pPr>
-        <w:spacing w:before="32" w:after="0" w:lineRule="exact" w:line="227"/>
+        <w:spacing w:before="32" w:after="0" w:lineRule="exact" w:line="222"/>
       </w:pPr>
       <w:r>
         <w:rPr>
@@ -900,7 +946,7 @@
           <w:b/>
           <w:i w:val="0"/>
           <w:color w:val="000000"/>
-          <w:sz w:val="19"/>
+          <w:sz w:val="18"/>
         </w:rPr>
         <w:t>Technical:</w:t>
       </w:r>
@@ -910,14 +956,14 @@
           <w:b w:val="0"/>
           <w:i w:val="0"/>
           <w:color w:val="000000"/>
-          <w:sz w:val="19"/>
+          <w:sz w:val="18"/>
         </w:rPr>
-        <w:t xml:space="preserve"> Python (pandas, openpyxl), Advanced Excel (PivotTables, VLOOKUP, macros), Power BI, PowerPoint, Word</w:t>
+        <w:t xml:space="preserve"> Python (pandas, NumPy, openpyxl, Matplotlib), Advanced Excel (PivotTables, VLOOKUP, macros), Power BI, PowerPoint, Bloomberg Terminal (BDH/BDP), Screener.in, Chartink, TradingView</w:t>
       </w:r>
     </w:p>
     <w:p>
       <w:pPr>
-        <w:spacing w:before="32" w:after="0" w:lineRule="exact" w:line="227"/>
+        <w:spacing w:before="32" w:after="0" w:lineRule="exact" w:line="222"/>
       </w:pPr>
       <w:r>
         <w:rPr>
@@ -925,32 +971,7 @@
           <w:b/>
           <w:i w:val="0"/>
           <w:color w:val="000000"/>
-          <w:sz w:val="19"/>
-        </w:rPr>
-        <w:t>Platforms &amp; Data:</w:t>
-      </w:r>
-      <w:r>
-        <w:rPr>
-          <w:rFonts w:ascii="Times New Roman" w:hAnsi="Times New Roman"/>
-          <w:b w:val="0"/>
-          <w:i w:val="0"/>
-          <w:color w:val="000000"/>
-          <w:sz w:val="19"/>
-        </w:rPr>
-        <w:t xml:space="preserve"> Bloomberg Terminal (BDH/BDP), Screener.in, Chartink, TradingView</w:t>
-      </w:r>
-    </w:p>
-    <w:p>
-      <w:pPr>
-        <w:spacing w:before="32" w:after="0" w:lineRule="exact" w:line="227"/>
-      </w:pPr>
-      <w:r>
-        <w:rPr>
-          <w:rFonts w:ascii="Times New Roman" w:hAnsi="Times New Roman"/>
-          <w:b/>
-          <w:i w:val="0"/>
-          <w:color w:val="000000"/>
-          <w:sz w:val="19"/>
+          <w:sz w:val="18"/>
         </w:rPr>
         <w:t>AI-Enabled Workflow:</w:t>
       </w:r>
@@ -960,30 +981,14 @@
           <w:b w:val="0"/>
           <w:i w:val="0"/>
           <w:color w:val="000000"/>
-          <w:sz w:val="19"/>
+          <w:sz w:val="18"/>
         </w:rPr>
-        <w:t xml:space="preserve"> ChatGPT and Claude for research synthesis, data clean-up, document drafting and workflow automation</w:t>
+        <w:t xml:space="preserve"> ChatGPT and Claude for code generation and review, research synthesis, data clean-up and document drafting</w:t>
       </w:r>
     </w:p>
     <w:p>
       <w:pPr>
-        <w:spacing w:before="120" w:after="52" w:lineRule="exact" w:line="234"/>
-        <w:pBdr>
-          <w:bottom w:val="single" w:sz="6" w:space="1" w:color="000000"/>
-        </w:pBdr>
-      </w:pPr>
-      <w:r>
-        <w:rPr>
-          <w:rFonts w:ascii="Times New Roman" w:hAnsi="Times New Roman"/>
-          <w:b/>
-          <w:sz w:val="20"/>
-        </w:rPr>
-        <w:t>ADDITIONAL INFORMATION</w:t>
-      </w:r>
-    </w:p>
-    <w:p>
-      <w:pPr>
-        <w:spacing w:before="32" w:after="0" w:lineRule="exact" w:line="227"/>
+        <w:spacing w:before="32" w:after="0" w:lineRule="exact" w:line="222"/>
       </w:pPr>
       <w:r>
         <w:rPr>
@@ -991,7 +996,7 @@
           <w:b/>
           <w:i w:val="0"/>
           <w:color w:val="000000"/>
-          <w:sz w:val="19"/>
+          <w:sz w:val="18"/>
         </w:rPr>
         <w:t>Strengths:</w:t>
       </w:r>
@@ -1001,14 +1006,14 @@
           <w:b w:val="0"/>
           <w:i w:val="0"/>
           <w:color w:val="000000"/>
-          <w:sz w:val="19"/>
+          <w:sz w:val="18"/>
         </w:rPr>
-        <w:t xml:space="preserve"> Attention to detail and data accuracy  ·  quality review discipline  ·  deadline delivery</w:t>
+        <w:t xml:space="preserve"> Attention to detail and data accuracy  ·  quality review and control discipline  ·  clear communication  ·  collaboration  ·  intellectual curiosity</w:t>
       </w:r>
     </w:p>
     <w:p>
       <w:pPr>
-        <w:spacing w:before="32" w:after="0" w:lineRule="exact" w:line="227"/>
+        <w:spacing w:before="32" w:after="0" w:lineRule="exact" w:line="222"/>
       </w:pPr>
       <w:r>
         <w:rPr>
@@ -1016,32 +1021,7 @@
           <w:b/>
           <w:i w:val="0"/>
           <w:color w:val="000000"/>
-          <w:sz w:val="19"/>
-        </w:rPr>
-        <w:t>Working style:</w:t>
-      </w:r>
-      <w:r>
-        <w:rPr>
-          <w:rFonts w:ascii="Times New Roman" w:hAnsi="Times New Roman"/>
-          <w:b w:val="0"/>
-          <w:i w:val="0"/>
-          <w:color w:val="000000"/>
-          <w:sz w:val="19"/>
-        </w:rPr>
-        <w:t xml:space="preserve"> Clear written and verbal communication  ·  collaboration across diverse teams  ·  initiative and intellectual curiosity</w:t>
-      </w:r>
-    </w:p>
-    <w:p>
-      <w:pPr>
-        <w:spacing w:before="32" w:after="0" w:lineRule="exact" w:line="227"/>
-      </w:pPr>
-      <w:r>
-        <w:rPr>
-          <w:rFonts w:ascii="Times New Roman" w:hAnsi="Times New Roman"/>
-          <w:b/>
-          <w:i w:val="0"/>
-          <w:color w:val="000000"/>
-          <w:sz w:val="19"/>
+          <w:sz w:val="18"/>
         </w:rPr>
         <w:t>Languages:</w:t>
       </w:r>
@@ -1051,34 +1031,9 @@
           <w:b w:val="0"/>
           <w:i w:val="0"/>
           <w:color w:val="000000"/>
-          <w:sz w:val="19"/>
+          <w:sz w:val="18"/>
         </w:rPr>
-        <w:t xml:space="preserve"> English (professional)  ·  Tamil (native)  ·  Kannada (conversational)  ·  Hindi (conversational)</w:t>
-      </w:r>
-    </w:p>
-    <w:p>
-      <w:pPr>
-        <w:spacing w:before="32" w:after="0" w:lineRule="exact" w:line="227"/>
-      </w:pPr>
-      <w:r>
-        <w:rPr>
-          <w:rFonts w:ascii="Times New Roman" w:hAnsi="Times New Roman"/>
-          <w:b/>
-          <w:i w:val="0"/>
-          <w:color w:val="000000"/>
-          <w:sz w:val="19"/>
-        </w:rPr>
-        <w:t>Additional:</w:t>
-      </w:r>
-      <w:r>
-        <w:rPr>
-          <w:rFonts w:ascii="Times New Roman" w:hAnsi="Times New Roman"/>
-          <w:b w:val="0"/>
-          <w:i w:val="0"/>
-          <w:color w:val="000000"/>
-          <w:sz w:val="19"/>
-        </w:rPr>
-        <w:t xml:space="preserve"> Expected graduation 2027  ·  open to full-time roles in Bengaluru  ·  interests: fine arts, home gardening</w:t>
+        <w:t xml:space="preserve"> English (professional)  ·  Tamil (native)  ·  Kannada and Hindi (conversational)  ·  interests: fine arts, home gardening</w:t>
       </w:r>
     </w:p>
     <w:sectPr>
@@ -1459,7 +1414,7 @@
     </w:pPr>
     <w:rPr>
       <w:rFonts w:ascii="Times New Roman" w:hAnsi="Times New Roman" w:eastAsia="Times New Roman"/>
-      <w:sz w:val="19"/>
+      <w:sz w:val="18"/>
     </w:rPr>
   </w:style>
   <w:style w:type="paragraph" w:styleId="Header">

</xml_diff>

<commit_message>
Reframe trading project around the risk-control audit
- Project section rebuilt from the full build report: engineering,
  validation, findings (negative results), and the risk-control audit
- Audit bullet leads on the inverted reward:risk finding (0.1:1 vs a 2.0
  policy minimum) and the remediation: 2x ATR stops, 1%-risk sizing with
  10% cap, 1.5R targets, data validation, 7 defects closed, 3 mis-set
  stops covering ~USD 107k of notional
- Live operation stated as a USD 1M simulated paper portfolio, 14 closed
  trades over 6 sessions, with the small-sample caveat on the page
- Realised P&L and the 100% win rate left off deliberately (rationale in
  resume/README.md)
- Trimmed elsewhere to hold one page in both PDF and Word
</commit_message>
<xml_diff>
--- a/resume/S-K-Lokesh-Resume.docx
+++ b/resume/S-K-Lokesh-Resume.docx
@@ -85,7 +85,7 @@
     </w:p>
     <w:p>
       <w:pPr>
-        <w:spacing w:before="88" w:after="0" w:lineRule="exact" w:line="222"/>
+        <w:spacing w:before="88" w:after="0" w:lineRule="exact" w:line="220"/>
         <w:jc w:val="both"/>
       </w:pPr>
       <w:r>
@@ -96,7 +96,7 @@
           <w:color w:val="000000"/>
           <w:sz w:val="18"/>
         </w:rPr>
-        <w:t>Final-year B.Com student (Class of 2027) and CFA Level I candidate applying to Commercial &amp; Investment Bank Research &amp; Analytics – Securities Services (Alternative Fund Services), Bengaluru, with the aim of building a career in fund accounting, portfolio accounting, NAV production, financial reporting and investor reporting. Delivered portfolio analytics at India’s largest listed wealth manager – rolling returns for 120+ funds automated in Python (~90% less manual effort) and PMS/AIF fee modelling worth INR 4.2 lakh a year to a client – and independently built a 6,500-line Python backtesting platform validated across 16.5 years of market data.</w:t>
+        <w:t>Final-year B.Com student (Class of 2027) and CFA Level I candidate applying to Commercial &amp; Investment Bank Research &amp; Analytics – Securities Services (Alternative Fund Services), Bengaluru, with the aim of building a career in fund accounting, portfolio accounting, NAV production, financial reporting and investor reporting. Delivered portfolio analytics at India’s largest listed wealth manager – rolling returns for 120+ funds automated in Python and PMS/AIF fee modelling worth INR 4.2 lakh a year to a client – and independently built, audited and remediated a 6,500-line Python trading-research platform validated across 16.5 years of market data.</w:t>
       </w:r>
     </w:p>
     <w:p>
@@ -120,7 +120,7 @@
         <w:tabs>
           <w:tab w:pos="10325" w:val="right"/>
         </w:tabs>
-        <w:spacing w:before="0" w:after="0" w:lineRule="exact" w:line="222"/>
+        <w:spacing w:before="0" w:after="0" w:lineRule="exact" w:line="220"/>
       </w:pPr>
       <w:r>
         <w:rPr>
@@ -173,7 +173,7 @@
     </w:p>
     <w:p>
       <w:pPr>
-        <w:spacing w:before="28" w:after="0" w:lineRule="exact" w:line="222"/>
+        <w:spacing w:before="28" w:after="0" w:lineRule="exact" w:line="220"/>
       </w:pPr>
       <w:r>
         <w:rPr>
@@ -206,7 +206,7 @@
         <w:tabs>
           <w:tab w:pos="10325" w:val="right"/>
         </w:tabs>
-        <w:spacing w:before="0" w:after="0" w:lineRule="exact" w:line="222"/>
+        <w:spacing w:before="0" w:after="0" w:lineRule="exact" w:line="220"/>
       </w:pPr>
       <w:r>
         <w:rPr>
@@ -252,7 +252,7 @@
         <w:tabs>
           <w:tab w:pos="10325" w:val="right"/>
         </w:tabs>
-        <w:spacing w:before="0" w:after="0" w:lineRule="exact" w:line="222"/>
+        <w:spacing w:before="0" w:after="0" w:lineRule="exact" w:line="220"/>
       </w:pPr>
       <w:r>
         <w:rPr>
@@ -309,7 +309,7 @@
         <w:tabs>
           <w:tab w:pos="10325" w:val="right"/>
         </w:tabs>
-        <w:spacing w:before="0" w:after="0" w:lineRule="exact" w:line="222"/>
+        <w:spacing w:before="0" w:after="0" w:lineRule="exact" w:line="220"/>
       </w:pPr>
       <w:r>
         <w:rPr>
@@ -362,7 +362,7 @@
     </w:p>
     <w:p>
       <w:pPr>
-        <w:spacing w:before="28" w:after="0" w:lineRule="exact" w:line="222"/>
+        <w:spacing w:before="28" w:after="0" w:lineRule="exact" w:line="220"/>
         <w:ind w:left="220" w:hanging="220"/>
       </w:pPr>
       <w:r>
@@ -398,7 +398,7 @@
     </w:p>
     <w:p>
       <w:pPr>
-        <w:spacing w:before="28" w:after="0" w:lineRule="exact" w:line="222"/>
+        <w:spacing w:before="28" w:after="0" w:lineRule="exact" w:line="220"/>
         <w:ind w:left="220" w:hanging="220"/>
       </w:pPr>
       <w:r>
@@ -434,7 +434,7 @@
     </w:p>
     <w:p>
       <w:pPr>
-        <w:spacing w:before="28" w:after="0" w:lineRule="exact" w:line="222"/>
+        <w:spacing w:before="28" w:after="0" w:lineRule="exact" w:line="220"/>
         <w:ind w:left="220" w:hanging="220"/>
       </w:pPr>
       <w:r>
@@ -470,7 +470,7 @@
     </w:p>
     <w:p>
       <w:pPr>
-        <w:spacing w:before="28" w:after="0" w:lineRule="exact" w:line="222"/>
+        <w:spacing w:before="28" w:after="0" w:lineRule="exact" w:line="220"/>
         <w:ind w:left="220" w:hanging="220"/>
       </w:pPr>
       <w:r>
@@ -491,7 +491,7 @@
           <w:color w:val="000000"/>
           <w:sz w:val="18"/>
         </w:rPr>
-        <w:t>Reference data &amp; Bloomberg:</w:t>
+        <w:t>Reference data &amp; client reporting:</w:t>
       </w:r>
       <w:r>
         <w:rPr>
@@ -501,43 +501,7 @@
           <w:color w:val="000000"/>
           <w:sz w:val="18"/>
         </w:rPr>
-        <w:t xml:space="preserve"> Maintained a 4,000+ security BSE/NSE dataset with Bloomberg BDH/BDP formulas and mapped client holdings against model portfolios to generate Buy/Sell/Hold calls for Investment Counsellors.</w:t>
-      </w:r>
-    </w:p>
-    <w:p>
-      <w:pPr>
-        <w:spacing w:before="28" w:after="0" w:lineRule="exact" w:line="222"/>
-        <w:ind w:left="220" w:hanging="220"/>
-      </w:pPr>
-      <w:r>
-        <w:rPr>
-          <w:rFonts w:ascii="Times New Roman" w:hAnsi="Times New Roman"/>
-          <w:b w:val="0"/>
-          <w:i w:val="0"/>
-          <w:color w:val="000000"/>
-          <w:sz w:val="18"/>
-        </w:rPr>
-        <w:t xml:space="preserve">•   </w:t>
-      </w:r>
-      <w:r>
-        <w:rPr>
-          <w:rFonts w:ascii="Times New Roman" w:hAnsi="Times New Roman"/>
-          <w:b/>
-          <w:i w:val="0"/>
-          <w:color w:val="000000"/>
-          <w:sz w:val="18"/>
-        </w:rPr>
-        <w:t>Client reporting:</w:t>
-      </w:r>
-      <w:r>
-        <w:rPr>
-          <w:rFonts w:ascii="Times New Roman" w:hAnsi="Times New Roman"/>
-          <w:b w:val="0"/>
-          <w:i w:val="0"/>
-          <w:color w:val="000000"/>
-          <w:sz w:val="18"/>
-        </w:rPr>
-        <w:t xml:space="preserve"> Co-authored a 30+ slide institutional deck on active vs. passive fund performance (rolling alpha, hit rates, alpha dispersion by market-cap segment) used by advisory teams with clients.</w:t>
+        <w:t xml:space="preserve"> Maintained a 4,000+ security BSE/NSE dataset with Bloomberg BDH/BDP formulas, mapping holdings against model portfolios to generate Buy/Sell/Hold calls; co-authored a 30+ slide institutional deck on active vs. passive performance (rolling alpha, hit rates, alpha dispersion by market cap).</w:t>
       </w:r>
     </w:p>
     <w:p>
@@ -550,7 +514,7 @@
         <w:tabs>
           <w:tab w:pos="10325" w:val="right"/>
         </w:tabs>
-        <w:spacing w:before="0" w:after="0" w:lineRule="exact" w:line="222"/>
+        <w:spacing w:before="0" w:after="0" w:lineRule="exact" w:line="220"/>
       </w:pPr>
       <w:r>
         <w:rPr>
@@ -588,22 +552,7 @@
     </w:p>
     <w:p>
       <w:pPr>
-        <w:spacing w:before="16" w:after="0" w:lineRule="exact" w:line="218"/>
-      </w:pPr>
-      <w:r>
-        <w:rPr>
-          <w:rFonts w:ascii="Times New Roman" w:hAnsi="Times New Roman"/>
-          <w:b w:val="0"/>
-          <w:i/>
-          <w:color w:val="000000"/>
-          <w:sz w:val="17"/>
-        </w:rPr>
-        <w:t>Charitable home for 50+ destitute elderly residents, run by The Guanellian Society  ·  Bengaluru, India</w:t>
-      </w:r>
-    </w:p>
-    <w:p>
-      <w:pPr>
-        <w:spacing w:before="28" w:after="0" w:lineRule="exact" w:line="222"/>
+        <w:spacing w:before="28" w:after="0" w:lineRule="exact" w:line="220"/>
         <w:ind w:left="220" w:hanging="220"/>
       </w:pPr>
       <w:r>
@@ -614,7 +563,7 @@
           <w:color w:val="000000"/>
           <w:sz w:val="18"/>
         </w:rPr>
-        <w:t>•   Rebuilt resident records, activity logs and medical-room inventory, and ran safety audits (extinguisher expiry, hazard documentation, signage) to support compliance, preparing the reporting decks used by staff.</w:t>
+        <w:t>•   Charitable home for 50+ destitute elderly residents (The Guanellian Society): rebuilt resident records, activity logs and medical-room inventory, and ran facility safety audits to support compliance, preparing the reporting decks used by staff.</w:t>
       </w:r>
     </w:p>
     <w:p>
@@ -638,7 +587,7 @@
         <w:tabs>
           <w:tab w:pos="10325" w:val="right"/>
         </w:tabs>
-        <w:spacing w:before="0" w:after="0" w:lineRule="exact" w:line="222"/>
+        <w:spacing w:before="0" w:after="0" w:lineRule="exact" w:line="220"/>
       </w:pPr>
       <w:r>
         <w:rPr>
@@ -648,7 +597,7 @@
           <w:color w:val="000000"/>
           <w:sz w:val="18"/>
         </w:rPr>
-        <w:t>Equity Backtesting &amp; Screening Platform</w:t>
+        <w:t>Quantitative Swing-Trading Suite</w:t>
       </w:r>
       <w:r>
         <w:rPr>
@@ -658,7 +607,7 @@
           <w:color w:val="000000"/>
           <w:sz w:val="18"/>
         </w:rPr>
-        <w:t xml:space="preserve">  |  Independent Python project, AI-assisted build</w:t>
+        <w:t xml:space="preserve">  |  Independent Python build (RSI-2 mean reversion), AI-assisted</w:t>
       </w:r>
       <w:r>
         <w:tab/>
@@ -686,12 +635,12 @@
           <w:color w:val="000000"/>
           <w:sz w:val="17"/>
         </w:rPr>
-        <w:t>6,500-line research stack, 10 build iterations; run daily to screen a 500-name US universe for a USD 100,000 simulated paper-trading portfolio  ·  also a 2+ year retail investor in Indian equities</w:t>
+        <w:t>6,500-line research and execution stack, 10 build iterations  ·  run daily against a USD 1,000,000 simulated paper portfolio: 14 closed trades over 6 sessions, ~1% risk each, zero stop-outs – a favourable-regime sample, not presented as a repeatable edge</w:t>
       </w:r>
     </w:p>
     <w:p>
       <w:pPr>
-        <w:spacing w:before="28" w:after="0" w:lineRule="exact" w:line="222"/>
+        <w:spacing w:before="28" w:after="0" w:lineRule="exact" w:line="220"/>
         <w:ind w:left="220" w:hanging="220"/>
       </w:pPr>
       <w:r>
@@ -722,12 +671,12 @@
           <w:color w:val="000000"/>
           <w:sz w:val="18"/>
         </w:rPr>
-        <w:t xml:space="preserve"> Built a modular platform (pandas, NumPy, yfinance, Matplotlib) spanning data ingestion, 12 technical indicators, a backtest engine, ATR stops, 1%-risk sizing, performance analytics (Sharpe, Sortino, profit factor, expectancy, R-multiples) and automated reporting.</w:t>
+        <w:t xml:space="preserve"> Built a modular platform (pandas, NumPy, yfinance, Matplotlib): validated and cached data ingestion, 12 indicators, a backtest engine, ATR stops, 1%-risk sizing, performance analytics (Sharpe, Sortino, profit factor, expectancy, R-multiples) and automated Markdown/PDF/Excel reporting.</w:t>
       </w:r>
     </w:p>
     <w:p>
       <w:pPr>
-        <w:spacing w:before="28" w:after="0" w:lineRule="exact" w:line="222"/>
+        <w:spacing w:before="28" w:after="0" w:lineRule="exact" w:line="220"/>
         <w:ind w:left="220" w:hanging="220"/>
       </w:pPr>
       <w:r>
@@ -748,7 +697,7 @@
           <w:color w:val="000000"/>
           <w:sz w:val="18"/>
         </w:rPr>
-        <w:t>Validation methodology:</w:t>
+        <w:t>Validation:</w:t>
       </w:r>
       <w:r>
         <w:rPr>
@@ -758,12 +707,12 @@
           <w:color w:val="000000"/>
           <w:sz w:val="18"/>
         </w:rPr>
-        <w:t xml:space="preserve"> Tested 7 long and short strategies over 16.5 years (2010–2026) across 504- and 1,001-symbol universes and 8,600+ simulated trades: signals read at the close and filled at the next open to remove look-ahead, commission and slippage on every fill, walk-forward 3y-train/1y-test windows, and Monte-Carlo sampling of 250 ten-day windows.</w:t>
+        <w:t xml:space="preserve"> Tested 7 long and short strategies over 16.5 years (2010–2026) across 504- and 1,001-symbol universes and 8,600+ simulated trades – signals read at the close and filled at the next open to remove look-ahead, costs on every fill, walk-forward 3y-train/1y-test windows and Monte-Carlo sampling of 250 ten-day windows.</w:t>
       </w:r>
     </w:p>
     <w:p>
       <w:pPr>
-        <w:spacing w:before="28" w:after="0" w:lineRule="exact" w:line="222"/>
+        <w:spacing w:before="28" w:after="0" w:lineRule="exact" w:line="220"/>
         <w:ind w:left="220" w:hanging="220"/>
       </w:pPr>
       <w:r>
@@ -794,7 +743,43 @@
           <w:color w:val="000000"/>
           <w:sz w:val="18"/>
         </w:rPr>
-        <w:t xml:space="preserve"> Showed a multi-indicator confluence score did not lift win rate (flat 60–62% across score buckets) and that widening the universe from 504 to 1,001 names cut CAGR 5.3% to 1.2%; a graduated regime filter cut max drawdown −34.5% to −28.8%, and the edge disappeared at 2–3x assumed costs – reported with survivorship-bias and regime caveats rather than optimised results.</w:t>
+        <w:t xml:space="preserve"> Showed multi-indicator confluence scoring did not lift win rate (flat 60–62% across score buckets) and that widening the universe 504→1,001 names cut CAGR 5.3%→1.2%; a graduated regime filter cut max drawdown −34.5%→−28.8% and the edge disappeared at 2–3x assumed costs – reported with survivorship-bias and regime caveats instead of optimised results.</w:t>
+      </w:r>
+    </w:p>
+    <w:p>
+      <w:pPr>
+        <w:spacing w:before="28" w:after="0" w:lineRule="exact" w:line="220"/>
+        <w:ind w:left="220" w:hanging="220"/>
+      </w:pPr>
+      <w:r>
+        <w:rPr>
+          <w:rFonts w:ascii="Times New Roman" w:hAnsi="Times New Roman"/>
+          <w:b w:val="0"/>
+          <w:i w:val="0"/>
+          <w:color w:val="000000"/>
+          <w:sz w:val="18"/>
+        </w:rPr>
+        <w:t xml:space="preserve">•   </w:t>
+      </w:r>
+      <w:r>
+        <w:rPr>
+          <w:rFonts w:ascii="Times New Roman" w:hAnsi="Times New Roman"/>
+          <w:b/>
+          <w:i w:val="0"/>
+          <w:color w:val="000000"/>
+          <w:sz w:val="18"/>
+        </w:rPr>
+        <w:t>Risk-control audit &amp; remediation:</w:t>
+      </w:r>
+      <w:r>
+        <w:rPr>
+          <w:rFonts w:ascii="Times New Roman" w:hAnsi="Times New Roman"/>
+          <w:b w:val="0"/>
+          <w:i w:val="0"/>
+          <w:color w:val="000000"/>
+          <w:sz w:val="18"/>
+        </w:rPr>
+        <w:t xml:space="preserve"> Audited the suite against its own risk policy and found reward:risk inverted at ~0.1:1 versus a 2.0 minimum; tightened stops from 3x to 2x ATR, enforced 1%-risk sizing with a 10% position cap and explicit 1.5R targets, and added a data-validation layer rejecting corrupt prices (&gt;60% one-day jumps, High &lt; Low) plus fixed silent exception handling that had disabled the earnings filter – closing 7 defects, including 3 mis-set stops that left ~USD 107k of notional unprotected.</w:t>
       </w:r>
     </w:p>
     <w:p>
@@ -818,7 +803,7 @@
         <w:tabs>
           <w:tab w:pos="10325" w:val="right"/>
         </w:tabs>
-        <w:spacing w:before="0" w:after="0" w:lineRule="exact" w:line="222"/>
+        <w:spacing w:before="0" w:after="0" w:lineRule="exact" w:line="220"/>
       </w:pPr>
       <w:r>
         <w:rPr>
@@ -856,7 +841,7 @@
     </w:p>
     <w:p>
       <w:pPr>
-        <w:spacing w:before="28" w:after="0" w:lineRule="exact" w:line="222"/>
+        <w:spacing w:before="28" w:after="0" w:lineRule="exact" w:line="220"/>
         <w:ind w:left="220" w:hanging="220"/>
       </w:pPr>
       <w:r>
@@ -888,7 +873,7 @@
     </w:p>
     <w:p>
       <w:pPr>
-        <w:spacing w:before="32" w:after="0" w:lineRule="exact" w:line="222"/>
+        <w:spacing w:before="32" w:after="0" w:lineRule="exact" w:line="220"/>
       </w:pPr>
       <w:r>
         <w:rPr>
@@ -913,7 +898,7 @@
     </w:p>
     <w:p>
       <w:pPr>
-        <w:spacing w:before="32" w:after="0" w:lineRule="exact" w:line="222"/>
+        <w:spacing w:before="32" w:after="0" w:lineRule="exact" w:line="220"/>
       </w:pPr>
       <w:r>
         <w:rPr>
@@ -938,7 +923,7 @@
     </w:p>
     <w:p>
       <w:pPr>
-        <w:spacing w:before="32" w:after="0" w:lineRule="exact" w:line="222"/>
+        <w:spacing w:before="32" w:after="0" w:lineRule="exact" w:line="220"/>
       </w:pPr>
       <w:r>
         <w:rPr>
@@ -963,7 +948,7 @@
     </w:p>
     <w:p>
       <w:pPr>
-        <w:spacing w:before="32" w:after="0" w:lineRule="exact" w:line="222"/>
+        <w:spacing w:before="32" w:after="0" w:lineRule="exact" w:line="220"/>
       </w:pPr>
       <w:r>
         <w:rPr>
@@ -983,13 +968,8 @@
           <w:color w:val="000000"/>
           <w:sz w:val="18"/>
         </w:rPr>
-        <w:t xml:space="preserve"> ChatGPT and Claude for code generation and review, research synthesis, data clean-up and document drafting</w:t>
+        <w:t xml:space="preserve"> ChatGPT and Claude for code generation and review, research synthesis and document drafting  ·  </w:t>
       </w:r>
-    </w:p>
-    <w:p>
-      <w:pPr>
-        <w:spacing w:before="32" w:after="0" w:lineRule="exact" w:line="222"/>
-      </w:pPr>
       <w:r>
         <w:rPr>
           <w:rFonts w:ascii="Times New Roman" w:hAnsi="Times New Roman"/>
@@ -1008,12 +988,12 @@
           <w:color w:val="000000"/>
           <w:sz w:val="18"/>
         </w:rPr>
-        <w:t xml:space="preserve"> Attention to detail and data accuracy  ·  quality review and control discipline  ·  clear communication  ·  collaboration  ·  intellectual curiosity</w:t>
+        <w:t xml:space="preserve"> attention to detail, data accuracy, quality review and control discipline, communication, collaboration, curiosity</w:t>
       </w:r>
     </w:p>
     <w:p>
       <w:pPr>
-        <w:spacing w:before="32" w:after="0" w:lineRule="exact" w:line="222"/>
+        <w:spacing w:before="32" w:after="0" w:lineRule="exact" w:line="220"/>
       </w:pPr>
       <w:r>
         <w:rPr>
@@ -1038,7 +1018,7 @@
     </w:p>
     <w:sectPr>
       <w:pgSz w:w="11909" w:h="16834"/>
-      <w:pgMar w:top="619" w:right="792" w:bottom="504" w:left="792" w:header="720" w:footer="720" w:gutter="0"/>
+      <w:pgMar w:top="619" w:right="792" w:bottom="432" w:left="792" w:header="720" w:footer="720" w:gutter="0"/>
       <w:cols w:space="720"/>
       <w:docGrid w:linePitch="360"/>
     </w:sectPr>

</xml_diff>